<commit_message>
edit meta figures and edit chap 4
</commit_message>
<xml_diff>
--- a/Manuscript/Manuscript_V11.docx
+++ b/Manuscript/Manuscript_V11.docx
@@ -1579,7 +1579,29 @@
         <w:rPr>
           <w:rFonts w:cs="Arial" w:ascii="Arial" w:hAnsi="Arial"/>
         </w:rPr>
-        <w:t>). Specifically, the number of distinct observed species in PCR control is the lowest among three. Moreover, the number of taxa in paraffin control significantly exceed ones from buffer controls. Indeed, a blank paraffin negative control was processed by first scraping paraffin into lysis buffer for DNA extraction, followed by the inclusion of the extracted material in sterile water for subsequent PCR amplification. This sequential workflow (Figure 1A) is consistent with the observed contamination pattern, where paraffin controls harbored the highest number of environmental taxa, followed by DNA extraction buffer and PCR controls. All analyses are conducted via generalized linear model with respect to control types, after adjusting the effect of LP, year and season. Furthermore, β diversity reveals that NCT samples are significantly clustering with respect to control types (Figure 1C and supplementary table S3). Moreover, NCT samples are also heavily grouped with respect to LP, year, and season of processing. Indeed, the distance-based redundancy variation is mostly explain by LP (R</w:t>
+        <w:t>). Specifically, the number of distinct observed species in PCR control is the lowest among three. Moreover, the number of taxa in paraffin control significantly exceed ones from buffer controls</w:t>
+      </w:r>
+      <w:ins w:id="0" w:author="Linh Dang" w:date="2026-07-30T19:52:29Z">
+        <w:r>
+          <w:rPr>
+            <w:rFonts w:cs="Arial" w:ascii="Arial" w:hAnsi="Arial"/>
+          </w:rPr>
+          <w:t xml:space="preserve">, </w:t>
+        </w:r>
+      </w:ins>
+      <w:ins w:id="1" w:author="Linh Dang" w:date="2026-07-30T19:52:29Z">
+        <w:r>
+          <w:rPr>
+            <w:rFonts w:cs="Arial" w:ascii="Arial" w:hAnsi="Arial"/>
+          </w:rPr>
+          <w:t>after adjusting other covariates such as LP, year, and season</w:t>
+        </w:r>
+      </w:ins>
+      <w:r>
+        <w:rPr>
+          <w:rFonts w:cs="Arial" w:ascii="Arial" w:hAnsi="Arial"/>
+        </w:rPr>
+        <w:t>. Indeed, a blank paraffin negative control was processed by first scraping paraffin into lysis buffer for DNA extraction, followed by the inclusion of the extracted material in sterile water for subsequent PCR amplification. This sequential workflow (Figure 1A) is consistent with the observed contamination pattern, where paraffin controls harbored the highest number of environmental taxa, followed by DNA extraction buffer and PCR controls. All analyses are conducted via generalized linear model with respect to control types, after adjusting the effect of LP, year and season. Furthermore, β diversity reveals that NCT samples are significantly clustering with respect to control types (Figure 1C and supplementary table S3). Moreover, NCT samples are also heavily grouped with respect to LP, year, and season of processing. Indeed, the distance-based redundancy variation is mostly explain by LP (R</w:t>
       </w:r>
       <w:r>
         <w:rPr>
@@ -2442,6 +2464,14 @@
         </w:rPr>
         <w:t>To further assess the suitability of FFPE samples for intratumoral microbiome profiling, we evaluated whether microbial signals could be reliably restored from extremely low-biomass PDAC samples. Based on the preceding analyses, we considered the microbial profiles obtained from fresh frozen bulk samples after multi-layer decontamination (Nj) combined with technical replicates as the most reliable representation of the underlying intratumoral microbiome. These profiles were therefore used as a reference, or the ground truth, to evaluate the ability of different decontamination approaches to recover authentic microbial signals from FFPE samples.</w:t>
       </w:r>
+      <w:ins w:id="2" w:author="Linh Dang" w:date="2026-07-30T19:05:59Z">
+        <w:r>
+          <w:rPr>
+            <w:rFonts w:cs="Arial" w:ascii="Arial" w:hAnsi="Arial"/>
+          </w:rPr>
+          <w:t>To this end, we examined the concordance of bacterial profiles among paired FFPE samples and two FF technical replicates from 10 PDAC samples in the KPC mice cohort (Figure 4A).</w:t>
+        </w:r>
+      </w:ins>
     </w:p>
     <w:p>
       <w:pPr>
@@ -2450,71 +2480,269 @@
         <w:jc w:val="both"/>
         <w:rPr>
           <w:rFonts w:ascii="Arial" w:hAnsi="Arial" w:cs="Arial"/>
-        </w:rPr>
-      </w:pPr>
-      <w:r>
-        <w:rPr>
-          <w:rFonts w:cs="Arial" w:ascii="Arial" w:hAnsi="Arial"/>
-        </w:rPr>
-        <w:t>For FFPE samples, we compared the original non-decontaminated (ND) profiles with those generated after four decontamination strategies: restrictive filtering, decontam, SCRuB, and Nj. Regardless of the decontamination method applied, the bacterial community composition of FFPE samples remained apparently different from that of the corresponding fresh frozen bulk samples (</w:t>
-      </w:r>
-      <w:commentRangeStart w:id="0"/>
-      <w:r>
-        <w:rPr>
-          <w:rFonts w:cs="Arial" w:ascii="Arial" w:hAnsi="Arial"/>
-        </w:rPr>
-        <w:t>Figure 4A</w:t>
-      </w:r>
-      <w:r>
-        <w:rPr>
-          <w:rFonts w:cs="Arial" w:ascii="Arial" w:hAnsi="Arial"/>
-        </w:rPr>
-      </w:r>
-      <w:commentRangeEnd w:id="0"/>
-      <w:r>
-        <w:commentReference w:id="0"/>
-      </w:r>
-      <w:r>
-        <w:rPr>
-          <w:rFonts w:cs="Arial" w:ascii="Arial" w:hAnsi="Arial"/>
-        </w:rPr>
-        <w:t xml:space="preserve">). Notably, </w:t>
-      </w:r>
-      <w:r>
-        <w:rPr>
-          <w:rFonts w:cs="Arial" w:ascii="Arial" w:hAnsi="Arial"/>
-          <w:i/>
-          <w:iCs/>
-        </w:rPr>
-        <w:t>Sphingomonas</w:t>
-      </w:r>
-      <w:r>
-        <w:rPr>
-          <w:rFonts w:cs="Arial" w:ascii="Arial" w:hAnsi="Arial"/>
-        </w:rPr>
-        <w:t xml:space="preserve"> and </w:t>
-      </w:r>
-      <w:r>
-        <w:rPr>
-          <w:rFonts w:cs="Arial" w:ascii="Arial" w:hAnsi="Arial"/>
-          <w:i/>
-          <w:iCs/>
-        </w:rPr>
-        <w:t>Cutibacterium</w:t>
-      </w:r>
-      <w:r>
-        <w:rPr>
-          <w:rFonts w:cs="Arial" w:ascii="Arial" w:hAnsi="Arial"/>
-        </w:rPr>
-        <w:t xml:space="preserve"> dominated both the ND and decontam-processed FFPE profiles. Although restrictive filtering, SCRuB, and Nj substantially reduced the abundance of these genera, the resulting microbial communities still exhibited minimal concordance with their paired FF counterparts, which were considered to represent a less contaminated microbial profile (</w:t>
-      </w:r>
-      <w:commentRangeStart w:id="1"/>
-      <w:r>
-        <w:rPr>
-          <w:rFonts w:cs="Arial" w:ascii="Arial" w:hAnsi="Arial"/>
-        </w:rPr>
-        <w:t>Figure 4B).</w:t>
-      </w:r>
+          <w:ins w:id="6" w:author="Linh Dang" w:date="2026-07-30T19:43:04Z"/>
+        </w:rPr>
+      </w:pPr>
+      <w:r>
+        <w:rPr>
+          <w:rFonts w:cs="Arial" w:ascii="Arial" w:hAnsi="Arial"/>
+        </w:rPr>
+        <w:t xml:space="preserve">For FFPE samples, we compared the original non-decontaminated (ND) profiles with those generated after four decontamination strategies: restrictive filtering, decontam, SCRuB, and Nj. </w:t>
+      </w:r>
+      <w:ins w:id="3" w:author="Linh Dang" w:date="2026-07-30T19:43:04Z">
+        <w:r>
+          <w:rPr>
+            <w:rFonts w:cs="Arial" w:ascii="Arial" w:hAnsi="Arial"/>
+          </w:rPr>
+          <w:t xml:space="preserve">Notably, regardless of whether the data were ND or processed by any decontamination method, FFPE samples consistently exhibited significantly lower alpha diversity than the two FF technical replicates, as measured by both the number of observed species and the Shannon diversity index. The two FF technical replicates were highly consistent with each other under most conditions, with the exception of the ND and </w:t>
+        </w:r>
+      </w:ins>
+      <w:ins w:id="4" w:author="Linh Dang" w:date="2026-07-30T19:43:04Z">
+        <w:r>
+          <w:rPr>
+            <w:rFonts w:cs="Arial" w:ascii="Arial" w:hAnsi="Arial"/>
+          </w:rPr>
+          <w:t>Decontam</w:t>
+        </w:r>
+      </w:ins>
+      <w:ins w:id="5" w:author="Linh Dang" w:date="2026-07-30T19:43:04Z">
+        <w:r>
+          <w:rPr>
+            <w:rFonts w:cs="Arial" w:ascii="Arial" w:hAnsi="Arial"/>
+          </w:rPr>
+          <w:t xml:space="preserve"> (Figure 4B).</w:t>
+        </w:r>
+      </w:ins>
+    </w:p>
+    <w:p>
+      <w:pPr>
+        <w:pStyle w:val="BodyText"/>
+        <w:spacing w:lineRule="auto" w:line="480"/>
+        <w:jc w:val="both"/>
+        <w:rPr>
+          <w:rFonts w:ascii="Arial" w:hAnsi="Arial" w:cs="Arial"/>
+          <w:ins w:id="10" w:author="Linh Dang" w:date="2026-07-30T19:43:04Z"/>
+        </w:rPr>
+      </w:pPr>
+      <w:ins w:id="7" w:author="Linh Dang" w:date="2026-07-30T19:43:04Z">
+        <w:r>
+          <w:rPr>
+            <w:rFonts w:cs="Arial" w:ascii="Arial" w:hAnsi="Arial"/>
+          </w:rPr>
+          <w:t xml:space="preserve">In the distance-based redundancy analyses, Wrench and rarefaction normalization produced comparable results. Under both normalization approaches, the </w:t>
+        </w:r>
+      </w:ins>
+      <w:ins w:id="8" w:author="Linh Dang" w:date="2026-07-30T19:43:04Z">
+        <w:r>
+          <w:rPr>
+            <w:rFonts w:cs="Arial" w:ascii="Arial" w:hAnsi="Arial"/>
+          </w:rPr>
+          <w:t xml:space="preserve">ND profile of </w:t>
+        </w:r>
+      </w:ins>
+      <w:ins w:id="9" w:author="Linh Dang" w:date="2026-07-30T19:43:04Z">
+        <w:r>
+          <w:rPr>
+            <w:rFonts w:cs="Arial" w:ascii="Arial" w:hAnsi="Arial"/>
+          </w:rPr>
+          <w:t>two FF technical replicates and the corresponding FFPE samples clustered closely with their respective technical replicates. Following decontamination, particularly with the Restrictive, SCRuB, and Nj methods, the two FF technical replicates converged into a single cluster, suggesting that decontamination effectively removed sample-specific contaminants and improved inter-replicate concordance. In contrast, regardless of the decontamination strategy applied, FFPE samples consistently formed a distinct cluster, indicating that they retained a bacterial profile that differed substantially from their paired FF counterparts (Figure 4C).</w:t>
+        </w:r>
+      </w:ins>
+    </w:p>
+    <w:p>
+      <w:pPr>
+        <w:pStyle w:val="BodyText"/>
+        <w:spacing w:lineRule="auto" w:line="480"/>
+        <w:jc w:val="both"/>
+        <w:rPr>
+          <w:rFonts w:ascii="Arial" w:hAnsi="Arial" w:cs="Arial"/>
+        </w:rPr>
+      </w:pPr>
+      <w:ins w:id="11" w:author="Linh Dang" w:date="2026-07-30T19:43:04Z">
+        <w:r>
+          <w:rPr>
+            <w:rFonts w:cs="Arial" w:ascii="Arial" w:hAnsi="Arial"/>
+          </w:rPr>
+          <w:t xml:space="preserve">The overall bacterial composition further supported these observations (Figure 4D). </w:t>
+        </w:r>
+      </w:ins>
+      <w:ins w:id="12" w:author="Linh Dang" w:date="2026-07-30T19:43:04Z">
+        <w:r>
+          <w:rPr>
+            <w:rFonts w:cs="Arial" w:ascii="Arial" w:hAnsi="Arial"/>
+            <w:i/>
+            <w:iCs/>
+          </w:rPr>
+          <w:t>Sphingomonas</w:t>
+        </w:r>
+      </w:ins>
+      <w:ins w:id="13" w:author="Linh Dang" w:date="2026-07-30T19:43:04Z">
+        <w:r>
+          <w:rPr>
+            <w:rFonts w:cs="Arial" w:ascii="Arial" w:hAnsi="Arial"/>
+          </w:rPr>
+          <w:t xml:space="preserve"> and </w:t>
+        </w:r>
+      </w:ins>
+      <w:ins w:id="14" w:author="Linh Dang" w:date="2026-07-30T19:43:04Z">
+        <w:r>
+          <w:rPr>
+            <w:rFonts w:cs="Arial" w:ascii="Arial" w:hAnsi="Arial"/>
+            <w:i/>
+            <w:iCs/>
+          </w:rPr>
+          <w:t>Cutibacterium</w:t>
+        </w:r>
+      </w:ins>
+      <w:ins w:id="15" w:author="Linh Dang" w:date="2026-07-30T19:43:04Z">
+        <w:r>
+          <w:rPr>
+            <w:rFonts w:cs="Arial" w:ascii="Arial" w:hAnsi="Arial"/>
+          </w:rPr>
+          <w:t xml:space="preserve"> remained dominant taxa in both the ND and decontaminated FFPE profiles. In the ND dataset, each sample exhibited a small but detectable overlap in bacterial species shared between the FFPE sample and its two paired FF technical replicates. Although Restrictive filtering, SCRuB, and Nj substantially reduced the abundance of these dominant genera, the resulting FFPE microbial communities still showed only minimal compositional concordance with their paired FF samples, which were considered to represent a less contaminated microbial profile (</w:t>
+        </w:r>
+      </w:ins>
+      <w:ins w:id="16" w:author="Linh Dang" w:date="2026-07-30T19:43:04Z">
+        <w:r>
+          <w:rPr>
+            <w:rFonts w:cs="Arial" w:ascii="Arial" w:hAnsi="Arial"/>
+          </w:rPr>
+          <w:t xml:space="preserve">Figure 4C and </w:t>
+        </w:r>
+      </w:ins>
+      <w:ins w:id="17" w:author="Linh Dang" w:date="2026-07-30T19:43:04Z">
+        <w:r>
+          <w:rPr>
+            <w:rFonts w:cs="Arial" w:ascii="Arial" w:hAnsi="Arial"/>
+          </w:rPr>
+          <w:t>Supplementary Figure S3).</w:t>
+        </w:r>
+      </w:ins>
+      <w:del w:id="18" w:author="Linh Dang" w:date="2026-07-30T19:28:48Z">
+        <w:r>
+          <w:rPr>
+            <w:rFonts w:cs="Arial" w:ascii="Arial" w:hAnsi="Arial"/>
+          </w:rPr>
+          <w:delText>Regardless of the decontamination method applied, the bacterial community composition of FFPE samples remained apparently different from that of the corresponding fresh frozen bulk samples (Figure 4A</w:delText>
+        </w:r>
+      </w:del>
+      <w:del w:id="19" w:author="Linh Dang" w:date="2026-07-30T19:28:48Z">
+        <w:r>
+          <w:rPr>
+            <w:rFonts w:cs="Arial" w:ascii="Arial" w:hAnsi="Arial"/>
+          </w:rPr>
+          <w:commentReference w:id="0"/>
+        </w:r>
+      </w:del>
+      <w:del w:id="20" w:author="Linh Dang" w:date="2026-07-30T19:28:48Z">
+        <w:r>
+          <w:rPr>
+            <w:rFonts w:cs="Arial" w:ascii="Arial" w:hAnsi="Arial"/>
+          </w:rPr>
+          <w:delText>)</w:delText>
+        </w:r>
+      </w:del>
+      <w:del w:id="21" w:author="Linh Dang" w:date="2026-07-30T19:42:42Z">
+        <w:r>
+          <w:rPr>
+            <w:rFonts w:cs="Arial" w:ascii="Arial" w:hAnsi="Arial"/>
+          </w:rPr>
+          <w:delText xml:space="preserve">. </w:delText>
+        </w:r>
+      </w:del>
+      <w:del w:id="22" w:author="Linh Dang" w:date="2026-07-30T19:30:48Z">
+        <w:r>
+          <w:rPr>
+            <w:rFonts w:cs="Arial" w:ascii="Arial" w:hAnsi="Arial"/>
+          </w:rPr>
+          <w:delText>Notably,</w:delText>
+        </w:r>
+      </w:del>
+      <w:del w:id="23" w:author="Linh Dang" w:date="2026-07-30T19:42:42Z">
+        <w:r>
+          <w:rPr>
+            <w:rFonts w:cs="Arial" w:ascii="Arial" w:hAnsi="Arial"/>
+          </w:rPr>
+          <w:delText xml:space="preserve"> </w:delText>
+        </w:r>
+      </w:del>
+      <w:del w:id="24" w:author="Linh Dang" w:date="2026-07-30T19:42:42Z">
+        <w:r>
+          <w:rPr>
+            <w:rFonts w:cs="Arial" w:ascii="Arial" w:hAnsi="Arial"/>
+            <w:i/>
+            <w:iCs/>
+          </w:rPr>
+          <w:delText>Sphingomonas</w:delText>
+        </w:r>
+      </w:del>
+      <w:del w:id="25" w:author="Linh Dang" w:date="2026-07-30T19:42:42Z">
+        <w:r>
+          <w:rPr>
+            <w:rFonts w:cs="Arial" w:ascii="Arial" w:hAnsi="Arial"/>
+          </w:rPr>
+          <w:delText xml:space="preserve"> and </w:delText>
+        </w:r>
+      </w:del>
+      <w:del w:id="26" w:author="Linh Dang" w:date="2026-07-30T19:42:42Z">
+        <w:r>
+          <w:rPr>
+            <w:rFonts w:cs="Arial" w:ascii="Arial" w:hAnsi="Arial"/>
+            <w:i/>
+            <w:iCs/>
+          </w:rPr>
+          <w:delText>Cutibacterium</w:delText>
+        </w:r>
+      </w:del>
+      <w:del w:id="27" w:author="Linh Dang" w:date="2026-07-30T19:42:42Z">
+        <w:r>
+          <w:rPr>
+            <w:rFonts w:cs="Arial" w:ascii="Arial" w:hAnsi="Arial"/>
+          </w:rPr>
+          <w:delText xml:space="preserve"> dominated both the ND and decontam-processed FFPE profiles. </w:delText>
+        </w:r>
+      </w:del>
+      <w:del w:id="28" w:author="Linh Dang" w:date="2026-07-30T19:40:57Z">
+        <w:r>
+          <w:rPr>
+            <w:rFonts w:cs="Arial" w:ascii="Arial" w:hAnsi="Arial"/>
+          </w:rPr>
+          <w:delText>A</w:delText>
+        </w:r>
+      </w:del>
+      <w:del w:id="29" w:author="Linh Dang" w:date="2026-07-30T19:42:42Z">
+        <w:r>
+          <w:rPr>
+            <w:rFonts w:cs="Arial" w:ascii="Arial" w:hAnsi="Arial"/>
+          </w:rPr>
+          <w:delText>lthough restrictive filtering, SCRuB, and Nj substantially reduced the abundance of these genera, the resulting microbial communities still exhibited minimal concordance with their paired FF counterparts, which were considered to represent a less contaminated microbial profile (</w:delText>
+        </w:r>
+      </w:del>
+      <w:del w:id="30" w:author="Linh Dang" w:date="2026-07-30T19:42:42Z">
+        <w:commentRangeStart w:id="1"/>
+        <w:r>
+          <w:rPr>
+            <w:rFonts w:cs="Arial" w:ascii="Arial" w:hAnsi="Arial"/>
+          </w:rPr>
+          <w:delText xml:space="preserve">Figure </w:delText>
+        </w:r>
+      </w:del>
+      <w:del w:id="31" w:author="Linh Dang" w:date="2026-07-30T19:33:08Z">
+        <w:r>
+          <w:rPr>
+            <w:rFonts w:cs="Arial" w:ascii="Arial" w:hAnsi="Arial"/>
+          </w:rPr>
+          <w:delText>4B</w:delText>
+        </w:r>
+      </w:del>
+      <w:del w:id="32" w:author="Linh Dang" w:date="2026-07-30T19:42:42Z">
+        <w:r>
+          <w:rPr>
+            <w:rFonts w:cs="Arial" w:ascii="Arial" w:hAnsi="Arial"/>
+          </w:rPr>
+          <w:delText>).</w:delText>
+        </w:r>
+      </w:del>
       <w:commentRangeEnd w:id="1"/>
       <w:r>
         <w:commentReference w:id="1"/>
@@ -3652,7 +3880,23 @@
         <w:rPr>
           <w:rFonts w:cs="Arial" w:ascii="Arial" w:hAnsi="Arial"/>
         </w:rPr>
-        <w:t>This approach identified human commensals from the intestines in PDAC samples, thereby providing evidence of the highly probable existence of an intratumoral microbiome. Nevertheless, incorporating hundreds of NCTs is largely impractical for mechanism-focused studies and experimental mouse models. Furthermore, the applicability of the Nj approach to smaller sample sets has not previously been established. To the best of our knowledge, this study is the first to systematically benchmark different decontamination strategies for PDAC microbiome samples.</w:t>
+        <w:t xml:space="preserve">This approach identified human commensals from the intestines in PDAC samples, thereby providing evidence of the highly probable existence of an intratumoral microbiome. Nevertheless, incorporating hundreds of NCTs is largely impractical for mechanism-focused studies and experimental mouse models. Furthermore, the applicability of the Nj approach to smaller sample sets has not previously been established. </w:t>
+      </w:r>
+      <w:commentRangeStart w:id="2"/>
+      <w:r>
+        <w:rPr>
+          <w:rFonts w:cs="Arial" w:ascii="Arial" w:hAnsi="Arial"/>
+        </w:rPr>
+        <w:t>To the best of our knowledge, this study is the first to systematically benchmark different decontamination strategies for PDAC microbiome samples.</w:t>
+      </w:r>
+      <w:commentRangeEnd w:id="2"/>
+      <w:r>
+        <w:commentReference w:id="2"/>
+      </w:r>
+      <w:r>
+        <w:rPr>
+          <w:rFonts w:cs="Arial" w:ascii="Arial" w:hAnsi="Arial"/>
+        </w:rPr>
       </w:r>
     </w:p>
     <w:p>
@@ -3786,7 +4030,7 @@
         </w:rPr>
         <w:t xml:space="preserve">Supplementary Table 5). </w:t>
       </w:r>
-      <w:commentRangeStart w:id="2"/>
+      <w:commentRangeStart w:id="3"/>
       <w:r>
         <w:rPr>
           <w:rFonts w:cs="Arial" w:ascii="Arial" w:hAnsi="Arial"/>
@@ -3798,9 +4042,15 @@
           <w:rFonts w:cs="Arial" w:ascii="Arial" w:hAnsi="Arial"/>
         </w:rPr>
       </w:r>
-      <w:commentRangeEnd w:id="2"/>
-      <w:r>
-        <w:commentReference w:id="2"/>
+      <w:commentRangeEnd w:id="3"/>
+      <w:r>
+        <w:commentReference w:id="3"/>
+      </w:r>
+      <w:r>
+        <w:rPr>
+          <w:rFonts w:cs="Arial" w:ascii="Arial" w:hAnsi="Arial"/>
+        </w:rPr>
+        <w:commentReference w:id="4"/>
       </w:r>
       <w:sdt>
         <w:sdtPr>
@@ -3871,15 +4121,16 @@
         <w:rPr>
           <w:rFonts w:cs="Arial" w:ascii="Arial" w:hAnsi="Arial"/>
         </w:rPr>
-        <w:t xml:space="preserve">. There might be several reasons for the moderate to poor performance of SCRuB. </w:t>
-      </w:r>
-      <w:commentRangeStart w:id="3"/>
-      <w:r>
-        <w:rPr>
-          <w:rFonts w:cs="Arial" w:ascii="Arial" w:hAnsi="Arial"/>
-        </w:rPr>
-        <w:t>Firstly, SCRuB assumes consistency in the contamination neglecting heterogeneity introduced by the batch effect</w:t>
-      </w:r>
+        <w:t xml:space="preserve">. </w:t>
+      </w:r>
+      <w:del w:id="33" w:author="Linh Dang" w:date="2026-07-30T15:12:21Z">
+        <w:r>
+          <w:rPr>
+            <w:rFonts w:cs="Arial" w:ascii="Arial" w:hAnsi="Arial"/>
+          </w:rPr>
+          <w:delText>There might be several reasons for the moderate to poor performance of SCRuB. Firstly, SCRuB assumes consistency in the contamination neglecting heterogeneity introduced by the batch effect</w:delText>
+        </w:r>
+      </w:del>
       <w:sdt>
         <w:sdtPr>
           <w:placeholder>
@@ -3895,77 +4146,165 @@
               <w:rFonts w:cs="Arial" w:ascii="Arial" w:hAnsi="Arial"/>
             </w:rPr>
           </w:r>
-          <w:r>
-            <w:fldChar w:fldCharType="begin"/>
-          </w:r>
-          <w:r>
-            <w:rPr>
-              <w:rFonts w:cs="Arial" w:ascii="Arial" w:hAnsi="Arial"/>
-            </w:rPr>
-            <w:instrText xml:space="preserve">ADDIN CitaviPlaceholder{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}</w:instrText>
-          </w:r>
-          <w:r>
-            <w:rPr>
-              <w:rFonts w:cs="Arial" w:ascii="Arial" w:hAnsi="Arial"/>
-            </w:rPr>
-          </w:r>
+          <w:del w:id="34" w:author="Linh Dang" w:date="2026-07-30T15:12:21Z">
+            <w:r>
+              <w:fldChar w:fldCharType="begin"/>
+            </w:r>
+            <w:r>
+              <w:rPr>
+                <w:rFonts w:cs="Arial" w:ascii="Arial" w:hAnsi="Arial"/>
+              </w:rPr>
+            </w:r>
+          </w:del>
+          <w:del w:id="35" w:author="Linh Dang" w:date="2026-07-30T15:12:21Z">
+            <w:r>
+              <w:rPr>
+                <w:rFonts w:cs="Arial" w:ascii="Arial" w:hAnsi="Arial"/>
+              </w:rPr>
+            </w:r>
+          </w:del>
           <w:r>
             <w:rPr>
               <w:rFonts w:cs="Arial" w:ascii="Arial" w:hAnsi="Arial"/>
             </w:rPr>
             <w:fldChar w:fldCharType="separate"/>
           </w:r>
-          <w:r>
-            <w:rPr>
-              <w:rFonts w:cs="Arial" w:ascii="Arial" w:hAnsi="Arial"/>
-            </w:rPr>
-          </w:r>
-          <w:r>
-            <w:rPr>
-              <w:rFonts w:cs="Arial" w:ascii="Arial" w:hAnsi="Arial"/>
+          <w:del w:id="36" w:author="Linh Dang" w:date="2026-07-30T15:12:21Z">
+            <w:r>
+              <w:rPr>
+                <w:rFonts w:cs="Arial" w:ascii="Arial" w:hAnsi="Arial"/>
+              </w:rPr>
+            </w:r>
+          </w:del>
+          <w:del w:id="37" w:author="Linh Dang" w:date="2026-07-30T15:12:21Z">
+            <w:r>
+              <w:rPr>
+                <w:rFonts w:cs="Arial" w:ascii="Arial" w:hAnsi="Arial"/>
+                <w:vertAlign w:val="superscript"/>
+              </w:rPr>
+              <w:delText>9</w:delText>
+            </w:r>
+          </w:del>
+          <w:del w:id="38" w:author="Linh Dang" w:date="2026-07-30T15:12:21Z">
+            <w:r>
+              <w:rPr>
+                <w:rFonts w:cs="Arial" w:ascii="Arial" w:hAnsi="Arial"/>
+                <w:vertAlign w:val="superscript"/>
+              </w:rPr>
+            </w:r>
+          </w:del>
+          <w:r>
+            <w:rPr>
               <w:vertAlign w:val="superscript"/>
-            </w:rPr>
-            <w:t>9</w:t>
-          </w:r>
-          <w:r>
-            <w:rPr>
-              <w:rFonts w:cs="Arial" w:ascii="Arial" w:hAnsi="Arial"/>
-            </w:rPr>
-          </w:r>
-          <w:r>
-            <w:rPr>
               <w:rFonts w:cs="Arial" w:ascii="Arial" w:hAnsi="Arial"/>
             </w:rPr>
             <w:fldChar w:fldCharType="end"/>
           </w:r>
-          <w:r>
-            <w:rPr>
-              <w:rFonts w:cs="Arial" w:ascii="Arial" w:hAnsi="Arial"/>
-            </w:rPr>
-          </w:r>
+          <w:del w:id="39" w:author="Linh Dang" w:date="2026-07-30T15:12:21Z">
+            <w:r>
+              <w:rPr>
+                <w:rFonts w:cs="Arial" w:ascii="Arial" w:hAnsi="Arial"/>
+              </w:rPr>
+            </w:r>
+          </w:del>
         </w:sdtContent>
       </w:sdt>
-      <w:r>
-        <w:rPr>
-          <w:rFonts w:cs="Arial" w:ascii="Arial" w:hAnsi="Arial"/>
-        </w:rPr>
-        <w:t>. Secondly, we hypothesize an overlap of taxa that occur in both NCT and true samples, violating the assumption of clear distinct compositions between both</w:t>
-      </w:r>
-      <w:r>
-        <w:rPr>
-          <w:rFonts w:cs="Arial" w:ascii="Arial" w:hAnsi="Arial"/>
-        </w:rPr>
-      </w:r>
-      <w:commentRangeEnd w:id="3"/>
-      <w:r>
-        <w:commentReference w:id="3"/>
-      </w:r>
-      <w:r>
-        <w:rPr>
-          <w:rFonts w:cs="Arial" w:ascii="Arial" w:hAnsi="Arial"/>
-        </w:rPr>
-        <w:t xml:space="preserve">. Thirdly, the SCRuB based on multiple samples and might not applicable for a smaller sample set consisting of less than 50 samples. </w:t>
-      </w:r>
+      <w:del w:id="40" w:author="Linh Dang" w:date="2026-07-30T15:12:21Z">
+        <w:r>
+          <w:rPr>
+            <w:rFonts w:cs="Arial" w:ascii="Arial" w:hAnsi="Arial"/>
+          </w:rPr>
+          <w:delText>. Secondly, we hypothesize an overlap of taxa that occur in both NCT and true samples, violating the assumption of clear distinct compositions between both</w:delText>
+        </w:r>
+      </w:del>
+      <w:del w:id="41" w:author="Linh Dang" w:date="2026-07-30T15:12:21Z">
+        <w:r>
+          <w:rPr>
+            <w:rFonts w:cs="Arial" w:ascii="Arial" w:hAnsi="Arial"/>
+          </w:rPr>
+          <w:commentReference w:id="5"/>
+        </w:r>
+      </w:del>
+      <w:del w:id="42" w:author="Linh Dang" w:date="2026-07-30T15:12:21Z">
+        <w:r>
+          <w:rPr>
+            <w:rFonts w:cs="Arial" w:ascii="Arial" w:hAnsi="Arial"/>
+          </w:rPr>
+          <w:delText>. Thirdly, the SCRuB based on multiple samples and might not applicable for a smaller sample set consisting of less than 50 samples.</w:delText>
+        </w:r>
+      </w:del>
+      <w:r>
+        <w:rPr>
+          <w:rFonts w:cs="Arial" w:ascii="Arial" w:hAnsi="Arial"/>
+        </w:rPr>
+        <w:t xml:space="preserve"> </w:t>
+      </w:r>
+      <w:r>
+        <w:rPr>
+          <w:rFonts w:cs="Arial" w:ascii="Arial" w:hAnsi="Arial"/>
+        </w:rPr>
+        <w:t>SC</w:t>
+      </w:r>
+      <w:ins w:id="43" w:author="Linh Dang" w:date="2026-07-30T15:15:23Z">
+        <w:r>
+          <w:rPr>
+            <w:rFonts w:cs="Arial" w:ascii="Arial" w:hAnsi="Arial"/>
+          </w:rPr>
+          <w:t>RuB</w:t>
+        </w:r>
+      </w:ins>
+      <w:ins w:id="44" w:author="Linh Dang" w:date="2026-07-30T15:15:23Z">
+        <w:r>
+          <w:rPr>
+            <w:rFonts w:eastAsia="Aptos" w:cs="Arial" w:ascii="Arial" w:hAnsi="Arial"/>
+            <w:kern w:val="0"/>
+            <w:sz w:val="24"/>
+            <w:szCs w:val="24"/>
+            <w:lang w:val="en-US" w:eastAsia="zh-CN"/>
+            <w14:ligatures w14:val="none"/>
+          </w:rPr>
+          <w:t>’s relatively modest to poor p</w:t>
+        </w:r>
+      </w:ins>
+      <w:ins w:id="45" w:author="Linh Dang" w:date="2026-07-30T15:16:24Z">
+        <w:r>
+          <w:rPr>
+            <w:rFonts w:eastAsia="Aptos" w:cs="Arial" w:ascii="Arial" w:hAnsi="Arial"/>
+            <w:kern w:val="0"/>
+            <w:sz w:val="24"/>
+            <w:szCs w:val="24"/>
+            <w:lang w:val="en-US" w:eastAsia="zh-CN"/>
+            <w14:ligatures w14:val="none"/>
+          </w:rPr>
+          <w:t>erformance under our assessments may</w:t>
+        </w:r>
+      </w:ins>
+      <w:ins w:id="46" w:author="Linh Dang" w:date="2026-07-30T15:17:30Z">
+        <w:r>
+          <w:rPr>
+            <w:rFonts w:eastAsia="Aptos" w:cs="Arial" w:ascii="Arial" w:hAnsi="Arial"/>
+            <w:kern w:val="0"/>
+            <w:sz w:val="24"/>
+            <w:szCs w:val="24"/>
+            <w:lang w:val="en-US" w:eastAsia="zh-CN"/>
+            <w14:ligatures w14:val="none"/>
+          </w:rPr>
+          <w:t xml:space="preserve"> arise from a mismatch between its mechanism and the metric itself. Rather than entirely eliminating contaminant taxa, SCRuB probabilistically subtracts reads attributable to a pooled background source, leaving residual abundances of contaminant taxa. Consequently, a binary presence/absence based metric cannot be applicable, since a down-weighted but non-zero taxon still registers as present. Additionally, performance may be further limited by the absence of well-to-well spatial (plate position) information in our study, as SCRuB is reported to achieve its best results when such information is available. Nevertheless, the overall bacterial composition revealed by SCRuB remained comparable to that of Nj, suggesting that despite its apparent underperformance on our metric, the method still captured biologically meaningful signal.</w:t>
+        </w:r>
+      </w:ins>
+      <w:del w:id="47" w:author="Linh Dang" w:date="2026-07-30T15:17:29Z">
+        <w:r>
+          <w:rPr>
+            <w:rFonts w:eastAsia="Aptos" w:cs="Arial" w:ascii="Arial" w:hAnsi="Arial"/>
+            <w:kern w:val="0"/>
+            <w:sz w:val="24"/>
+            <w:szCs w:val="24"/>
+            <w:lang w:val="en-US" w:eastAsia="zh-CN"/>
+            <w14:ligatures w14:val="none"/>
+          </w:rPr>
+          <w:delText xml:space="preserve"> </w:delText>
+        </w:r>
+      </w:del>
     </w:p>
     <w:p>
       <w:pPr>
@@ -4457,7 +4796,7 @@
         </w:rPr>
         <w:t xml:space="preserve">Negative control samples were collected at several steps of a pipeline to counter against </w:t>
       </w:r>
-      <w:commentRangeStart w:id="4"/>
+      <w:commentRangeStart w:id="6"/>
       <w:r>
         <w:rPr>
           <w:rFonts w:cs="Arial" w:ascii="Arial" w:hAnsi="Arial"/>
@@ -4469,9 +4808,9 @@
           <w:rFonts w:cs="Arial" w:ascii="Arial" w:hAnsi="Arial"/>
         </w:rPr>
       </w:r>
-      <w:commentRangeEnd w:id="4"/>
-      <w:r>
-        <w:commentReference w:id="4"/>
+      <w:commentRangeEnd w:id="6"/>
+      <w:r>
+        <w:commentReference w:id="6"/>
       </w:r>
       <w:r>
         <w:rPr>
@@ -4612,7 +4951,7 @@
         </w:rPr>
         <w:t xml:space="preserve">) mouse model used in this study has been previously </w:t>
       </w:r>
-      <w:commentRangeStart w:id="5"/>
+      <w:commentRangeStart w:id="7"/>
       <w:r>
         <w:rPr>
           <w:rFonts w:cs="Arial" w:ascii="Arial" w:hAnsi="Arial"/>
@@ -4626,9 +4965,9 @@
           <w:color w:themeColor="text1" w:val="000000"/>
         </w:rPr>
       </w:r>
-      <w:commentRangeEnd w:id="5"/>
-      <w:r>
-        <w:commentReference w:id="5"/>
+      <w:commentRangeEnd w:id="7"/>
+      <w:r>
+        <w:commentReference w:id="7"/>
       </w:r>
       <w:r>
         <w:rPr>
@@ -4699,7 +5038,7 @@
           <w:color w:themeColor="text1" w:val="000000"/>
         </w:rPr>
       </w:pPr>
-      <w:commentRangeStart w:id="6"/>
+      <w:commentRangeStart w:id="8"/>
       <w:r>
         <w:rPr>
           <w:rFonts w:cs="Arial" w:ascii="Arial" w:hAnsi="Arial"/>
@@ -4725,9 +5064,9 @@
         <w:t>16S rRNA Sequencing</w:t>
       </w:r>
       <w:bookmarkEnd w:id="5"/>
-      <w:commentRangeEnd w:id="6"/>
-      <w:r>
-        <w:commentReference w:id="6"/>
+      <w:commentRangeEnd w:id="8"/>
+      <w:r>
+        <w:commentReference w:id="8"/>
       </w:r>
       <w:r>
         <w:rPr>
@@ -4767,7 +5106,7 @@
         </w:rPr>
         <w:t xml:space="preserve">We applied </w:t>
       </w:r>
-      <w:commentRangeStart w:id="7"/>
+      <w:commentRangeStart w:id="9"/>
       <w:r>
         <w:rPr>
           <w:rFonts w:cs="Arial" w:ascii="Arial" w:hAnsi="Arial"/>
@@ -4779,9 +5118,9 @@
           <w:rFonts w:cs="Arial" w:ascii="Arial" w:hAnsi="Arial"/>
         </w:rPr>
       </w:r>
-      <w:commentRangeEnd w:id="7"/>
-      <w:r>
-        <w:commentReference w:id="7"/>
+      <w:commentRangeEnd w:id="9"/>
+      <w:r>
+        <w:commentReference w:id="9"/>
       </w:r>
       <w:r>
         <w:rPr>
@@ -4929,7 +5268,7 @@
         </w:rPr>
         <w:t xml:space="preserve">Four decontamination approaches were evaluated: (1) Restrictive filtering: taxa detected in any </w:t>
       </w:r>
-      <w:commentRangeStart w:id="8"/>
+      <w:commentRangeStart w:id="10"/>
       <w:r>
         <w:rPr>
           <w:rFonts w:cs="Arial" w:ascii="Arial" w:hAnsi="Arial"/>
@@ -4942,9 +5281,9 @@
           <w:rFonts w:cs="Arial" w:ascii="Arial" w:hAnsi="Arial"/>
         </w:rPr>
       </w:r>
-      <w:commentRangeEnd w:id="8"/>
-      <w:r>
-        <w:commentReference w:id="8"/>
+      <w:commentRangeEnd w:id="10"/>
+      <w:r>
+        <w:commentReference w:id="10"/>
       </w:r>
       <w:r>
         <w:rPr>
@@ -6299,7 +6638,23 @@
       </w:r>
     </w:p>
   </w:comment>
-  <w:comment w:id="2" w:author="Christoph Ammer-Herrmenau" w:date="2026-07-29T21:27:00Z" w:initials="CA">
+  <w:comment w:id="2" w:author="Linh Dang" w:date="2026-07-30T12:18:28Z" w:initials="LD">
+    <w:p>
+      <w:pPr>
+        <w:overflowPunct w:val="false"/>
+        <w:spacing w:before="0" w:after="0"/>
+        <w:rPr/>
+      </w:pPr>
+      <w:r>
+        <w:rPr>
+          <w:rFonts w:ascii="Liberation Serif" w:hAnsi="Liberation Serif" w:eastAsia="DejaVu Sans" w:cs="Noto Sans Arabic UI"/>
+          <w:lang w:val="en-US" w:eastAsia="en-US" w:bidi="en-US"/>
+        </w:rPr>
+        <w:t>In the SCRuB paper, they also conducted a benchmarking with simulated data, but not intratumoral PDAC samples.</w:t>
+      </w:r>
+    </w:p>
+  </w:comment>
+  <w:comment w:id="3" w:author="Christoph Ammer-Herrmenau" w:date="2026-07-29T21:27:00Z" w:initials="CA">
     <w:p>
       <w:pPr>
         <w:overflowPunct w:val="false"/>
@@ -6331,7 +6686,7 @@
       </w:r>
     </w:p>
   </w:comment>
-  <w:comment w:id="3" w:author="Christoph Ammer-Herrmenau" w:date="2026-07-29T21:50:00Z" w:initials="CA">
+  <w:comment w:id="4" w:author="Linh Dang" w:date="2026-07-30T12:24:02Z" w:initials="LD">
     <w:p>
       <w:pPr>
         <w:overflowPunct w:val="false"/>
@@ -6341,13 +6696,31 @@
       <w:r>
         <w:rPr>
           <w:rFonts w:ascii="Liberation Serif" w:hAnsi="Liberation Serif" w:eastAsia="DejaVu Sans" w:cs="Noto Sans Arabic UI"/>
+          <w:i/>
+          <w:sz w:val="16"/>
           <w:lang w:val="en-US" w:eastAsia="en-US" w:bidi="en-US"/>
         </w:rPr>
-        <w:t>Agree?</w:t>
+        <w:t>Reply to Christoph Ammer-Herrmenau (07/29/2026, 21:27): "..."</w:t>
+      </w:r>
+    </w:p>
+    <w:p>
+      <w:pPr>
+        <w:overflowPunct w:val="false"/>
+        <w:spacing w:before="238" w:after="198"/>
+        <w:rPr/>
+      </w:pPr>
+      <w:r>
+        <w:rPr>
+          <w:rFonts w:ascii="Liberation Serif" w:hAnsi="Liberation Serif" w:eastAsia="DejaVu Sans" w:cs="Noto Sans Arabic UI"/>
+          <w:sz w:val="20"/>
+          <w:szCs w:val="20"/>
+          <w:lang w:val="en-US" w:eastAsia="en-US" w:bidi="en-US"/>
+        </w:rPr>
+        <w:t>Indeed, we used the cutoff value 0.5 (default is 0.1), which is condered more aggressive. Here is the quote from decontam’s author: “ In the prevalence test there is a special value worth knowing, threshold=0.5, that will identify as contaminants all sequences thare are more prevalent in negative controls than in positive samples.” https://benjjneb.github.io/decontam/vignettes/decontam_intro.html</w:t>
       </w:r>
     </w:p>
   </w:comment>
-  <w:comment w:id="4" w:author="Christoph Ammer-Herrmenau" w:date="2026-04-25T22:24:00Z" w:initials="CA">
+  <w:comment w:id="5" w:author="Christoph Ammer-Herrmenau" w:date="2026-07-29T21:50:00Z" w:initials="CA">
     <w:p>
       <w:pPr>
         <w:overflowPunct w:val="false"/>
@@ -6356,6 +6729,22 @@
       </w:pPr>
       <w:r>
         <w:rPr>
+          <w:rFonts w:ascii="Liberation Serif" w:hAnsi="Liberation Serif" w:eastAsia="DejaVu Sans" w:cs="Noto Sans Arabic UI"/>
+          <w:lang w:val="en-US" w:eastAsia="en-US" w:bidi="en-US"/>
+        </w:rPr>
+        <w:t>Agree?</w:t>
+      </w:r>
+    </w:p>
+  </w:comment>
+  <w:comment w:id="6" w:author="Christoph Ammer-Herrmenau" w:date="2026-04-25T22:24:00Z" w:initials="CA">
+    <w:p>
+      <w:pPr>
+        <w:overflowPunct w:val="false"/>
+        <w:spacing w:before="0" w:after="0"/>
+        <w:rPr/>
+      </w:pPr>
+      <w:r>
+        <w:rPr>
           <w:rFonts w:ascii="Liberation Serif" w:hAnsi="Liberation Serif" w:eastAsia="DejaVu Sans" w:cs="Liberation Serif"/>
           <w:lang w:val="en-US" w:eastAsia="en-US" w:bidi="en-US"/>
         </w:rPr>
@@ -6363,7 +6752,7 @@
       </w:r>
     </w:p>
   </w:comment>
-  <w:comment w:id="5" w:author="Christoph Ammer-Herrmenau" w:date="2026-04-25T22:28:00Z" w:initials="CA">
+  <w:comment w:id="7" w:author="Christoph Ammer-Herrmenau" w:date="2026-04-25T22:28:00Z" w:initials="CA">
     <w:p>
       <w:pPr>
         <w:overflowPunct w:val="false"/>
@@ -6379,7 +6768,7 @@
       </w:r>
     </w:p>
   </w:comment>
-  <w:comment w:id="6" w:author="Christoph Ammer-Herrmenau" w:date="2026-04-25T22:33:00Z" w:initials="CA">
+  <w:comment w:id="8" w:author="Christoph Ammer-Herrmenau" w:date="2026-04-25T22:33:00Z" w:initials="CA">
     <w:p>
       <w:pPr>
         <w:overflowPunct w:val="false"/>
@@ -6427,7 +6816,7 @@
       </w:r>
     </w:p>
   </w:comment>
-  <w:comment w:id="7" w:author="Christoph Ammer-Herrmenau" w:date="2026-04-25T22:22:00Z" w:initials="CA">
+  <w:comment w:id="9" w:author="Christoph Ammer-Herrmenau" w:date="2026-04-25T22:22:00Z" w:initials="CA">
     <w:p>
       <w:pPr>
         <w:overflowPunct w:val="false"/>
@@ -6443,7 +6832,7 @@
       </w:r>
     </w:p>
   </w:comment>
-  <w:comment w:id="8" w:author="Christoph Ammer-Herrmenau" w:date="2026-04-25T22:21:00Z" w:initials="CA">
+  <w:comment w:id="10" w:author="Christoph Ammer-Herrmenau" w:date="2026-04-25T22:21:00Z" w:initials="CA">
     <w:p>
       <w:pPr>
         <w:overflowPunct w:val="false"/>
@@ -6460,6 +6849,13 @@
     </w:p>
   </w:comment>
 </w:comments>
+</file>
+
+<file path=word/commentsExtended.xml><?xml version="1.0" encoding="utf-8"?>
+<w15:commentsEx xmlns:mc="http://schemas.openxmlformats.org/markup-compatibility/2006" xmlns:w15="http://schemas.microsoft.com/office/word/2012/wordml" mc:Ignorable="w15">
+  <w15:commentEx w15:paraId="02000000" w15:paraIdParent="01000000"/>
+  <w15:commentEx w15:paraId="03000000" w15:done="1"/>
+</w15:commentsEx>
 </file>
 
 <file path=word/styles.xml><?xml version="1.0" encoding="utf-8"?>
@@ -7593,6 +7989,10 @@
       <w14:ligatures w14:val="none"/>
     </w:rPr>
   </w:style>
+  <w:style w:type="character" w:styleId="LineNumber">
+    <w:name w:val="Line Number"/>
+    <w:rPr/>
+  </w:style>
   <w:style w:type="paragraph" w:styleId="Heading">
     <w:name w:val="Heading"/>
     <w:basedOn w:val="Normal"/>
@@ -7980,6 +8380,16 @@
     <w:rPr>
       <w:b/>
       <w:bCs/>
+    </w:rPr>
+  </w:style>
+  <w:style w:type="paragraph" w:styleId="Comment">
+    <w:name w:val="Comment"/>
+    <w:basedOn w:val="Normal"/>
+    <w:qFormat/>
+    <w:pPr/>
+    <w:rPr>
+      <w:sz w:val="20"/>
+      <w:szCs w:val="20"/>
     </w:rPr>
   </w:style>
   <w:style w:type="numbering" w:styleId="NoList" w:default="1">

</xml_diff>